<commit_message>
Updated english installation guide
</commit_message>
<xml_diff>
--- a/Documentation/Official Documentation/Installation guide for IBOS MusicXmlReader version 5.0.0.0.docx
+++ b/Documentation/Official Documentation/Installation guide for IBOS MusicXmlReader version 5.0.0.0.docx
@@ -108,7 +108,10 @@
         </w:rPr>
       </w:pPr>
       <w:r>
-        <w:rPr/>
+        <w:rPr>
+          <w:sz w:val="28"/>
+          <w:szCs w:val="28"/>
+        </w:rPr>
       </w:r>
     </w:p>
     <w:sdt>
@@ -135,6 +138,7 @@
             <w:rPr>
               <w:webHidden/>
               <w:rStyle w:val="Indeksspring"/>
+              <w:vanish w:val="false"/>
             </w:rPr>
             <w:instrText> TOC \z \o "1-3" \u \h</w:instrText>
           </w:r>
@@ -142,6 +146,7 @@
             <w:rPr>
               <w:webHidden/>
               <w:rStyle w:val="Indeksspring"/>
+              <w:vanish w:val="false"/>
             </w:rPr>
             <w:fldChar w:fldCharType="separate"/>
           </w:r>
@@ -150,6 +155,7 @@
               <w:rPr>
                 <w:webHidden/>
                 <w:rStyle w:val="Indeksspring"/>
+                <w:vanish w:val="false"/>
               </w:rPr>
               <w:t>System Requirements</w:t>
               <w:tab/>
@@ -171,6 +177,7 @@
               <w:rPr>
                 <w:webHidden/>
                 <w:rStyle w:val="Indeksspring"/>
+                <w:vanish w:val="false"/>
               </w:rPr>
               <w:t>Distribution of IBOS MusicXmlReader</w:t>
               <w:tab/>
@@ -192,6 +199,7 @@
               <w:rPr>
                 <w:webHidden/>
                 <w:rStyle w:val="Indeksspring"/>
+                <w:vanish w:val="false"/>
               </w:rPr>
               <w:t>Installation of IBOS MusicXmlReader</w:t>
               <w:tab/>
@@ -213,6 +221,7 @@
               <w:rPr>
                 <w:webHidden/>
                 <w:rStyle w:val="Indeksspring"/>
+                <w:vanish w:val="false"/>
               </w:rPr>
               <w:t>Setup of JAWS for IBOS MusicXmlReader</w:t>
               <w:tab/>
@@ -234,6 +243,7 @@
               <w:rPr>
                 <w:webHidden/>
                 <w:rStyle w:val="Indeksspring"/>
+                <w:vanish w:val="false"/>
               </w:rPr>
               <w:t>Installation of other tools</w:t>
               <w:tab/>
@@ -255,6 +265,7 @@
               <w:rPr>
                 <w:webHidden/>
                 <w:rStyle w:val="Indeksspring"/>
+                <w:vanish w:val="false"/>
               </w:rPr>
               <w:t>Using MusicXml Note Archives on the Internet</w:t>
               <w:tab/>
@@ -264,6 +275,7 @@
           <w:r>
             <w:rPr>
               <w:rStyle w:val="Indeksspring"/>
+              <w:vanish w:val="false"/>
             </w:rPr>
             <w:fldChar w:fldCharType="end"/>
           </w:r>
@@ -334,15 +346,37 @@
     <w:p>
       <w:pPr>
         <w:pStyle w:val="Normal"/>
-        <w:rPr>
-          <w:rFonts w:ascii="Arial" w:hAnsi="Arial" w:cs="Arial"/>
-        </w:rPr>
-      </w:pPr>
-      <w:r>
-        <w:rPr>
-          <w:rFonts w:cs="Arial" w:ascii="Arial" w:hAnsi="Arial"/>
-        </w:rPr>
-        <w:t>IBOS MusicXmlReader Version 4.0 is primarily tested with:</w:t>
+        <w:rPr/>
+      </w:pPr>
+      <w:r>
+        <w:rPr>
+          <w:rFonts w:cs="Arial" w:ascii="Arial" w:hAnsi="Arial"/>
+        </w:rPr>
+        <w:t xml:space="preserve">IBOS MusicXmlReader Version </w:t>
+      </w:r>
+      <w:r>
+        <w:rPr>
+          <w:rFonts w:cs="Arial" w:ascii="Arial" w:hAnsi="Arial"/>
+        </w:rPr>
+        <w:t>5</w:t>
+      </w:r>
+      <w:r>
+        <w:rPr>
+          <w:rFonts w:cs="Arial" w:ascii="Arial" w:hAnsi="Arial"/>
+        </w:rPr>
+        <w:t>.0.</w:t>
+      </w:r>
+      <w:r>
+        <w:rPr>
+          <w:rFonts w:cs="Arial" w:ascii="Arial" w:hAnsi="Arial"/>
+        </w:rPr>
+        <w:t>0.0</w:t>
+      </w:r>
+      <w:r>
+        <w:rPr>
+          <w:rFonts w:cs="Arial" w:ascii="Arial" w:hAnsi="Arial"/>
+        </w:rPr>
+        <w:t xml:space="preserve"> is primarily tested with:</w:t>
       </w:r>
     </w:p>
     <w:p>
@@ -390,7 +424,21 @@
         <w:rPr>
           <w:rFonts w:cs="Arial" w:ascii="Arial" w:hAnsi="Arial"/>
         </w:rPr>
-        <w:t>JAWS 2018</w:t>
+        <w:t xml:space="preserve">JAWS </w:t>
+      </w:r>
+      <w:r>
+        <w:rPr>
+          <w:rFonts w:cs="Arial" w:ascii="Arial" w:hAnsi="Arial"/>
+          <w:color w:val="C9211E"/>
+        </w:rPr>
+        <w:t>20</w:t>
+      </w:r>
+      <w:r>
+        <w:rPr>
+          <w:rFonts w:cs="Arial" w:ascii="Arial" w:hAnsi="Arial"/>
+          <w:color w:val="C9211E"/>
+        </w:rPr>
+        <w:t>22</w:t>
       </w:r>
     </w:p>
     <w:p>
@@ -959,15 +1007,15 @@
         </w:tblCellMar>
       </w:tblPr>
       <w:tblGrid>
-        <w:gridCol w:w="3226"/>
+        <w:gridCol w:w="3225"/>
         <w:gridCol w:w="2409"/>
-        <w:gridCol w:w="3541"/>
+        <w:gridCol w:w="3542"/>
       </w:tblGrid>
       <w:tr>
         <w:trPr/>
         <w:tc>
           <w:tcPr>
-            <w:tcW w:w="3226" w:type="dxa"/>
+            <w:tcW w:w="3225" w:type="dxa"/>
             <w:tcBorders>
               <w:top w:val="single" w:sz="4" w:space="0" w:color="000000"/>
               <w:left w:val="single" w:sz="4" w:space="0" w:color="000000"/>
@@ -1025,7 +1073,7 @@
         </w:tc>
         <w:tc>
           <w:tcPr>
-            <w:tcW w:w="3541" w:type="dxa"/>
+            <w:tcW w:w="3542" w:type="dxa"/>
             <w:tcBorders>
               <w:top w:val="single" w:sz="4" w:space="0" w:color="000000"/>
               <w:left w:val="single" w:sz="4" w:space="0" w:color="000000"/>
@@ -1058,7 +1106,7 @@
         <w:trPr/>
         <w:tc>
           <w:tcPr>
-            <w:tcW w:w="3226" w:type="dxa"/>
+            <w:tcW w:w="3225" w:type="dxa"/>
             <w:tcBorders>
               <w:top w:val="single" w:sz="4" w:space="0" w:color="000000"/>
               <w:left w:val="single" w:sz="4" w:space="0" w:color="000000"/>
@@ -1126,7 +1174,7 @@
         </w:tc>
         <w:tc>
           <w:tcPr>
-            <w:tcW w:w="3541" w:type="dxa"/>
+            <w:tcW w:w="3542" w:type="dxa"/>
             <w:tcBorders>
               <w:top w:val="single" w:sz="4" w:space="0" w:color="000000"/>
               <w:left w:val="single" w:sz="4" w:space="0" w:color="000000"/>
@@ -1140,7 +1188,7 @@
               <w:pStyle w:val="Normal"/>
               <w:widowControl/>
               <w:bidi w:val="0"/>
-              <w:spacing w:lineRule="auto" w:line="254" w:before="0" w:after="160"/>
+              <w:spacing w:lineRule="auto" w:line="252" w:before="0" w:after="160"/>
               <w:rPr/>
             </w:pPr>
             <w:r>
@@ -1156,7 +1204,7 @@
         <w:trPr/>
         <w:tc>
           <w:tcPr>
-            <w:tcW w:w="3226" w:type="dxa"/>
+            <w:tcW w:w="3225" w:type="dxa"/>
             <w:tcBorders>
               <w:top w:val="single" w:sz="4" w:space="0" w:color="000000"/>
               <w:left w:val="single" w:sz="4" w:space="0" w:color="000000"/>
@@ -1236,7 +1284,7 @@
         </w:tc>
         <w:tc>
           <w:tcPr>
-            <w:tcW w:w="3541" w:type="dxa"/>
+            <w:tcW w:w="3542" w:type="dxa"/>
             <w:tcBorders>
               <w:top w:val="single" w:sz="4" w:space="0" w:color="000000"/>
               <w:left w:val="single" w:sz="4" w:space="0" w:color="000000"/>
@@ -1266,7 +1314,7 @@
         <w:trPr/>
         <w:tc>
           <w:tcPr>
-            <w:tcW w:w="3226" w:type="dxa"/>
+            <w:tcW w:w="3225" w:type="dxa"/>
             <w:tcBorders>
               <w:top w:val="single" w:sz="4" w:space="0" w:color="000000"/>
               <w:left w:val="single" w:sz="4" w:space="0" w:color="000000"/>
@@ -1332,7 +1380,7 @@
         </w:tc>
         <w:tc>
           <w:tcPr>
-            <w:tcW w:w="3541" w:type="dxa"/>
+            <w:tcW w:w="3542" w:type="dxa"/>
             <w:tcBorders>
               <w:top w:val="single" w:sz="4" w:space="0" w:color="000000"/>
               <w:left w:val="single" w:sz="4" w:space="0" w:color="000000"/>
@@ -1346,7 +1394,7 @@
               <w:pStyle w:val="Normal"/>
               <w:widowControl/>
               <w:bidi w:val="0"/>
-              <w:spacing w:lineRule="auto" w:line="254" w:before="0" w:after="160"/>
+              <w:spacing w:lineRule="auto" w:line="252" w:before="0" w:after="160"/>
               <w:rPr/>
             </w:pPr>
             <w:r>
@@ -1362,7 +1410,7 @@
         <w:trPr/>
         <w:tc>
           <w:tcPr>
-            <w:tcW w:w="3226" w:type="dxa"/>
+            <w:tcW w:w="3225" w:type="dxa"/>
             <w:tcBorders>
               <w:top w:val="single" w:sz="4" w:space="0" w:color="000000"/>
               <w:left w:val="single" w:sz="4" w:space="0" w:color="000000"/>
@@ -1442,7 +1490,7 @@
         </w:tc>
         <w:tc>
           <w:tcPr>
-            <w:tcW w:w="3541" w:type="dxa"/>
+            <w:tcW w:w="3542" w:type="dxa"/>
             <w:tcBorders>
               <w:top w:val="single" w:sz="4" w:space="0" w:color="000000"/>
               <w:left w:val="single" w:sz="4" w:space="0" w:color="000000"/>
@@ -1524,15 +1572,15 @@
         </w:tblCellMar>
       </w:tblPr>
       <w:tblGrid>
-        <w:gridCol w:w="3574"/>
-        <w:gridCol w:w="2578"/>
-        <w:gridCol w:w="3100"/>
+        <w:gridCol w:w="3573"/>
+        <w:gridCol w:w="2577"/>
+        <w:gridCol w:w="3102"/>
       </w:tblGrid>
       <w:tr>
         <w:trPr/>
         <w:tc>
           <w:tcPr>
-            <w:tcW w:w="3574" w:type="dxa"/>
+            <w:tcW w:w="3573" w:type="dxa"/>
             <w:tcBorders>
               <w:top w:val="single" w:sz="4" w:space="0" w:color="000000"/>
               <w:left w:val="single" w:sz="4" w:space="0" w:color="000000"/>
@@ -1559,7 +1607,7 @@
         </w:tc>
         <w:tc>
           <w:tcPr>
-            <w:tcW w:w="2578" w:type="dxa"/>
+            <w:tcW w:w="2577" w:type="dxa"/>
             <w:tcBorders>
               <w:top w:val="single" w:sz="4" w:space="0" w:color="000000"/>
               <w:left w:val="single" w:sz="4" w:space="0" w:color="000000"/>
@@ -1572,7 +1620,7 @@
               <w:pStyle w:val="Normal"/>
               <w:widowControl/>
               <w:bidi w:val="0"/>
-              <w:spacing w:lineRule="auto" w:line="254" w:before="0" w:after="160"/>
+              <w:spacing w:lineRule="auto" w:line="252" w:before="0" w:after="160"/>
               <w:rPr>
                 <w:lang w:val="da-DK"/>
               </w:rPr>
@@ -1587,7 +1635,7 @@
         </w:tc>
         <w:tc>
           <w:tcPr>
-            <w:tcW w:w="3100" w:type="dxa"/>
+            <w:tcW w:w="3102" w:type="dxa"/>
             <w:tcBorders>
               <w:top w:val="single" w:sz="4" w:space="0" w:color="000000"/>
               <w:left w:val="single" w:sz="4" w:space="0" w:color="000000"/>
@@ -1618,7 +1666,7 @@
         <w:trPr/>
         <w:tc>
           <w:tcPr>
-            <w:tcW w:w="3574" w:type="dxa"/>
+            <w:tcW w:w="3573" w:type="dxa"/>
             <w:tcBorders>
               <w:top w:val="single" w:sz="4" w:space="0" w:color="000000"/>
               <w:left w:val="single" w:sz="4" w:space="0" w:color="000000"/>
@@ -1673,7 +1721,7 @@
               <w:pStyle w:val="Normal"/>
               <w:widowControl/>
               <w:bidi w:val="0"/>
-              <w:spacing w:lineRule="auto" w:line="254" w:before="0" w:after="160"/>
+              <w:spacing w:lineRule="auto" w:line="252" w:before="0" w:after="160"/>
               <w:rPr>
                 <w:lang w:val="en-US"/>
               </w:rPr>
@@ -1688,7 +1736,7 @@
         </w:tc>
         <w:tc>
           <w:tcPr>
-            <w:tcW w:w="2578" w:type="dxa"/>
+            <w:tcW w:w="2577" w:type="dxa"/>
             <w:tcBorders>
               <w:top w:val="single" w:sz="4" w:space="0" w:color="000000"/>
               <w:left w:val="single" w:sz="4" w:space="0" w:color="000000"/>
@@ -1701,7 +1749,7 @@
               <w:pStyle w:val="Normal"/>
               <w:widowControl/>
               <w:bidi w:val="0"/>
-              <w:spacing w:lineRule="auto" w:line="254" w:before="0" w:after="160"/>
+              <w:spacing w:lineRule="auto" w:line="252" w:before="0" w:after="160"/>
               <w:rPr>
                 <w:lang w:val="da-DK"/>
               </w:rPr>
@@ -1716,7 +1764,7 @@
         </w:tc>
         <w:tc>
           <w:tcPr>
-            <w:tcW w:w="3100" w:type="dxa"/>
+            <w:tcW w:w="3102" w:type="dxa"/>
             <w:tcBorders>
               <w:top w:val="single" w:sz="4" w:space="0" w:color="000000"/>
               <w:left w:val="single" w:sz="4" w:space="0" w:color="000000"/>
@@ -1730,7 +1778,7 @@
               <w:pStyle w:val="Normal"/>
               <w:widowControl/>
               <w:bidi w:val="0"/>
-              <w:spacing w:lineRule="auto" w:line="254" w:before="0" w:after="160"/>
+              <w:spacing w:lineRule="auto" w:line="252" w:before="0" w:after="160"/>
               <w:rPr>
                 <w:lang w:val="en-US"/>
               </w:rPr>
@@ -1748,7 +1796,7 @@
         <w:trPr/>
         <w:tc>
           <w:tcPr>
-            <w:tcW w:w="3574" w:type="dxa"/>
+            <w:tcW w:w="3573" w:type="dxa"/>
             <w:tcBorders>
               <w:top w:val="single" w:sz="4" w:space="0" w:color="000000"/>
               <w:left w:val="single" w:sz="4" w:space="0" w:color="000000"/>
@@ -1803,7 +1851,7 @@
               <w:pStyle w:val="Normal"/>
               <w:widowControl/>
               <w:bidi w:val="0"/>
-              <w:spacing w:lineRule="auto" w:line="254" w:before="0" w:after="160"/>
+              <w:spacing w:lineRule="auto" w:line="252" w:before="0" w:after="160"/>
               <w:rPr>
                 <w:lang w:val="en-US"/>
               </w:rPr>
@@ -1818,7 +1866,7 @@
         </w:tc>
         <w:tc>
           <w:tcPr>
-            <w:tcW w:w="2578" w:type="dxa"/>
+            <w:tcW w:w="2577" w:type="dxa"/>
             <w:tcBorders>
               <w:top w:val="single" w:sz="4" w:space="0" w:color="000000"/>
               <w:left w:val="single" w:sz="4" w:space="0" w:color="000000"/>
@@ -1831,7 +1879,7 @@
               <w:pStyle w:val="Normal"/>
               <w:widowControl/>
               <w:bidi w:val="0"/>
-              <w:spacing w:lineRule="auto" w:line="254" w:before="0" w:after="160"/>
+              <w:spacing w:lineRule="auto" w:line="252" w:before="0" w:after="160"/>
               <w:rPr>
                 <w:lang w:val="da-DK"/>
               </w:rPr>
@@ -1846,7 +1894,7 @@
         </w:tc>
         <w:tc>
           <w:tcPr>
-            <w:tcW w:w="3100" w:type="dxa"/>
+            <w:tcW w:w="3102" w:type="dxa"/>
             <w:tcBorders>
               <w:top w:val="single" w:sz="4" w:space="0" w:color="000000"/>
               <w:left w:val="single" w:sz="4" w:space="0" w:color="000000"/>
@@ -1860,7 +1908,7 @@
               <w:pStyle w:val="Normal"/>
               <w:widowControl/>
               <w:bidi w:val="0"/>
-              <w:spacing w:lineRule="auto" w:line="254" w:before="0" w:after="160"/>
+              <w:spacing w:lineRule="auto" w:line="252" w:before="0" w:after="160"/>
               <w:rPr>
                 <w:lang w:val="en-US"/>
               </w:rPr>
@@ -2006,7 +2054,7 @@
     </w:p>
     <w:tbl>
       <w:tblPr>
-        <w:tblW w:w="9640" w:type="dxa"/>
+        <w:tblW w:w="8955" w:type="dxa"/>
         <w:jc w:val="left"/>
         <w:tblInd w:w="0" w:type="dxa"/>
         <w:tblCellMar>
@@ -2017,13 +2065,13 @@
         </w:tblCellMar>
       </w:tblPr>
       <w:tblGrid>
-        <w:gridCol w:w="9640"/>
+        <w:gridCol w:w="8955"/>
       </w:tblGrid>
       <w:tr>
         <w:trPr/>
         <w:tc>
           <w:tcPr>
-            <w:tcW w:w="9640" w:type="dxa"/>
+            <w:tcW w:w="8955" w:type="dxa"/>
             <w:tcBorders>
               <w:top w:val="single" w:sz="2" w:space="0" w:color="000000"/>
               <w:left w:val="single" w:sz="2" w:space="0" w:color="000000"/>
@@ -2584,6 +2632,22 @@
         <w:pStyle w:val="Normal"/>
         <w:rPr>
           <w:rFonts w:ascii="Arial" w:hAnsi="Arial" w:cs="Arial"/>
+          <w:color w:val="C9211E"/>
+        </w:rPr>
+      </w:pPr>
+      <w:r>
+        <w:rPr>
+          <w:rFonts w:cs="Arial" w:ascii="Arial" w:hAnsi="Arial"/>
+          <w:color w:val="C9211E"/>
+        </w:rPr>
+        <w:t>Starting with IBOS MusicXmlReader version 5.0.0.0 the programs “PhotoScore” and “Braille Music Editor 2” are supported in the same way.</w:t>
+      </w:r>
+    </w:p>
+    <w:p>
+      <w:pPr>
+        <w:pStyle w:val="Normal"/>
+        <w:rPr>
+          <w:rFonts w:ascii="Arial" w:hAnsi="Arial" w:cs="Arial"/>
         </w:rPr>
       </w:pPr>
       <w:r>
@@ -2649,16 +2713,13 @@
     <w:p>
       <w:pPr>
         <w:pStyle w:val="Normal"/>
-        <w:rPr>
-          <w:rFonts w:ascii="Arial" w:hAnsi="Arial" w:cs="Arial"/>
+        <w:rPr/>
+      </w:pPr>
+      <w:r>
+        <w:rPr>
+          <w:rFonts w:cs="Arial" w:ascii="Arial" w:hAnsi="Arial"/>
           <w:color w:val="000000"/>
         </w:rPr>
-      </w:pPr>
-      <w:r>
-        <w:rPr>
-          <w:rFonts w:cs="Arial" w:ascii="Arial" w:hAnsi="Arial"/>
-          <w:color w:val="000000"/>
-        </w:rPr>
         <w:t>C:\Program Files (x86)\Finale NotePad 2012\Finale NotePad.exe</w:t>
       </w:r>
     </w:p>
@@ -2666,6 +2727,42 @@
       <w:pPr>
         <w:pStyle w:val="Normal"/>
         <w:rPr>
+          <w:rFonts w:ascii="Arial" w:hAnsi="Arial"/>
+          <w:sz w:val="20"/>
+          <w:szCs w:val="20"/>
+        </w:rPr>
+      </w:pPr>
+      <w:r>
+        <w:rPr>
+          <w:rFonts w:ascii="Arial" w:hAnsi="Arial"/>
+          <w:color w:val="C9211E"/>
+          <w:sz w:val="20"/>
+          <w:szCs w:val="20"/>
+        </w:rPr>
+        <w:t>C:\Program Files (x86)\Neuratron\PhotoScore + NotateMe Ultimate 2020\Neuratron PhotoScore.exe</w:t>
+      </w:r>
+    </w:p>
+    <w:p>
+      <w:pPr>
+        <w:pStyle w:val="Normal"/>
+        <w:rPr>
+          <w:rFonts w:ascii="Arial" w:hAnsi="Arial"/>
+        </w:rPr>
+      </w:pPr>
+      <w:r>
+        <w:rPr>
+          <w:rFonts w:cs="Arial" w:ascii="Arial" w:hAnsi="Arial"/>
+          <w:color w:val="C9211E"/>
+          <w:sz w:val="22"/>
+          <w:szCs w:val="22"/>
+        </w:rPr>
+        <w:t>C:\Program Files (x86)\Bme2\bme2.exe</w:t>
+      </w:r>
+    </w:p>
+    <w:p>
+      <w:pPr>
+        <w:pStyle w:val="Normal"/>
+        <w:rPr>
           <w:rFonts w:ascii="Arial" w:hAnsi="Arial" w:cs="Arial"/>
         </w:rPr>
       </w:pPr>
@@ -2685,6 +2782,19 @@
           <w:rFonts w:cs="Arial" w:ascii="Arial" w:hAnsi="Arial"/>
         </w:rPr>
         <w:t>If for some reason, these programs are not installed in their default locations, it is possible to set up their paths from “Settings” → “General Settings”</w:t>
+      </w:r>
+    </w:p>
+    <w:p>
+      <w:pPr>
+        <w:pStyle w:val="Normal"/>
+        <w:rPr/>
+      </w:pPr>
+      <w:r>
+        <w:rPr>
+          <w:rFonts w:cs="Arial" w:ascii="Arial" w:hAnsi="Arial"/>
+          <w:color w:val="C9211E"/>
+        </w:rPr>
+        <w:t>Please note that the tool “IBOS Music Braille Reader”, which is introduced with “IBOS MusicXmlReader” version 5.0.0.0 is integrated within “IBOS MusicXmlReader” and thus does not require a separate installation</w:t>
       </w:r>
     </w:p>
     <w:p>
@@ -2777,12 +2887,9 @@
       </w:r>
     </w:p>
     <w:sectPr>
-      <w:headerReference w:type="default" r:id="rId6"/>
-      <w:footerReference w:type="default" r:id="rId7"/>
       <w:type w:val="continuous"/>
       <w:pgSz w:w="11906" w:h="16838"/>
       <w:pgMar w:left="1440" w:right="1440" w:header="708" w:top="1440" w:footer="708" w:bottom="1440" w:gutter="0"/>
-      <w:pgNumType w:fmt="decimal"/>
       <w:formProt w:val="false"/>
       <w:textDirection w:val="lrTb"/>
       <w:docGrid w:type="default" w:linePitch="360" w:charSpace="0"/>
@@ -2792,42 +2899,6 @@
 </file>
 
 <file path=word/footer1.xml><?xml version="1.0" encoding="utf-8"?>
-<w:ftr xmlns:o="urn:schemas-microsoft-com:office:office" xmlns:r="http://schemas.openxmlformats.org/officeDocument/2006/relationships" xmlns:v="urn:schemas-microsoft-com:vml" xmlns:w="http://schemas.openxmlformats.org/wordprocessingml/2006/main" xmlns:w10="urn:schemas-microsoft-com:office:word" xmlns:wp="http://schemas.openxmlformats.org/drawingml/2006/wordprocessingDrawing" xmlns:wps="http://schemas.microsoft.com/office/word/2010/wordprocessingShape" xmlns:wpg="http://schemas.microsoft.com/office/word/2010/wordprocessingGroup" xmlns:mc="http://schemas.openxmlformats.org/markup-compatibility/2006" xmlns:wp14="http://schemas.microsoft.com/office/word/2010/wordprocessingDrawing" xmlns:w14="http://schemas.microsoft.com/office/word/2010/wordml" mc:Ignorable="w14 wp14">
-  <w:p>
-    <w:pPr>
-      <w:pStyle w:val="Sidefod"/>
-      <w:tabs>
-        <w:tab w:val="center" w:pos="4819" w:leader="none"/>
-        <w:tab w:val="right" w:pos="9638" w:leader="none"/>
-      </w:tabs>
-      <w:spacing w:before="0" w:after="160"/>
-      <w:rPr/>
-    </w:pPr>
-    <w:r>
-      <w:rPr/>
-      <w:fldChar w:fldCharType="begin"/>
-    </w:r>
-    <w:r>
-      <w:rPr/>
-      <w:instrText> FILENAME </w:instrText>
-    </w:r>
-    <w:r>
-      <w:rPr/>
-      <w:fldChar w:fldCharType="separate"/>
-    </w:r>
-    <w:r>
-      <w:rPr/>
-      <w:t>Installation guide for IBOS MusicXmlReader version 5.0.0.0.docx</w:t>
-    </w:r>
-    <w:r>
-      <w:rPr/>
-      <w:fldChar w:fldCharType="end"/>
-    </w:r>
-  </w:p>
-</w:ftr>
-</file>
-
-<file path=word/footer2.xml><?xml version="1.0" encoding="utf-8"?>
 <w:ftr xmlns:o="urn:schemas-microsoft-com:office:office" xmlns:r="http://schemas.openxmlformats.org/officeDocument/2006/relationships" xmlns:v="urn:schemas-microsoft-com:vml" xmlns:w="http://schemas.openxmlformats.org/wordprocessingml/2006/main" xmlns:w10="urn:schemas-microsoft-com:office:word" xmlns:wp="http://schemas.openxmlformats.org/drawingml/2006/wordprocessingDrawing" xmlns:wps="http://schemas.microsoft.com/office/word/2010/wordprocessingShape" xmlns:wpg="http://schemas.microsoft.com/office/word/2010/wordprocessingGroup" xmlns:mc="http://schemas.openxmlformats.org/markup-compatibility/2006" xmlns:wp14="http://schemas.microsoft.com/office/word/2010/wordprocessingDrawing" xmlns:w14="http://schemas.microsoft.com/office/word/2010/wordml" mc:Ignorable="w14 wp14">
   <w:p>
     <w:pPr>
@@ -2882,25 +2953,6 @@
 </w:hdr>
 </file>
 
-<file path=word/header2.xml><?xml version="1.0" encoding="utf-8"?>
-<w:hdr xmlns:o="urn:schemas-microsoft-com:office:office" xmlns:r="http://schemas.openxmlformats.org/officeDocument/2006/relationships" xmlns:v="urn:schemas-microsoft-com:vml" xmlns:w="http://schemas.openxmlformats.org/wordprocessingml/2006/main" xmlns:w10="urn:schemas-microsoft-com:office:word" xmlns:wp="http://schemas.openxmlformats.org/drawingml/2006/wordprocessingDrawing" xmlns:wps="http://schemas.microsoft.com/office/word/2010/wordprocessingShape" xmlns:wpg="http://schemas.microsoft.com/office/word/2010/wordprocessingGroup" xmlns:mc="http://schemas.openxmlformats.org/markup-compatibility/2006" xmlns:wp14="http://schemas.microsoft.com/office/word/2010/wordprocessingDrawing" xmlns:w14="http://schemas.microsoft.com/office/word/2010/wordml" mc:Ignorable="w14 wp14">
-  <w:p>
-    <w:pPr>
-      <w:pStyle w:val="Sidehoved"/>
-      <w:tabs>
-        <w:tab w:val="center" w:pos="4819" w:leader="none"/>
-        <w:tab w:val="right" w:pos="9638" w:leader="none"/>
-      </w:tabs>
-      <w:spacing w:before="0" w:after="160"/>
-      <w:rPr/>
-    </w:pPr>
-    <w:r>
-      <w:rPr/>
-    </w:r>
-  </w:p>
-</w:hdr>
-</file>
-
 <file path=word/numbering.xml><?xml version="1.0" encoding="utf-8"?>
 <w:numbering xmlns:w="http://schemas.openxmlformats.org/wordprocessingml/2006/main" xmlns:o="urn:schemas-microsoft-com:office:office" xmlns:r="http://schemas.openxmlformats.org/officeDocument/2006/relationships" xmlns:v="urn:schemas-microsoft-com:vml">
   <w:abstractNum w:abstractNumId="1">
@@ -3119,7 +3171,7 @@
     <w:pPr>
       <w:widowControl/>
       <w:bidi w:val="0"/>
-      <w:spacing w:lineRule="auto" w:line="254" w:before="0" w:after="160"/>
+      <w:spacing w:lineRule="auto" w:line="252" w:before="0" w:after="160"/>
       <w:jc w:val="left"/>
     </w:pPr>
     <w:rPr>

</xml_diff>